<commit_message>
Add GPT-2 quantization methods comparison
</commit_message>
<xml_diff>
--- a/quantized-gpt2-carbon-footprint/reports/FLOPs Estimation Summary.docx
+++ b/quantized-gpt2-carbon-footprint/reports/FLOPs Estimation Summary.docx
@@ -186,7 +186,6 @@
     <w:tbl>
       <w:tblPr>
         <w:tblW w:w="0" w:type="auto"/>
-        <w:jc w:val="center"/>
         <w:tblCellSpacing w:w="15" w:type="dxa"/>
         <w:tblBorders>
           <w:top w:val="single" w:sz="4" w:space="0" w:color="auto"/>
@@ -205,20 +204,19 @@
         <w:tblLook w:val="04A0" w:firstRow="1" w:lastRow="0" w:firstColumn="1" w:lastColumn="0" w:noHBand="0" w:noVBand="1"/>
       </w:tblPr>
       <w:tblGrid>
-        <w:gridCol w:w="2605"/>
-        <w:gridCol w:w="2070"/>
-        <w:gridCol w:w="2430"/>
-        <w:gridCol w:w="2245"/>
+        <w:gridCol w:w="2547"/>
+        <w:gridCol w:w="1266"/>
+        <w:gridCol w:w="3086"/>
+        <w:gridCol w:w="2451"/>
       </w:tblGrid>
       <w:tr>
         <w:trPr>
           <w:tblHeader/>
           <w:tblCellSpacing w:w="15" w:type="dxa"/>
-          <w:jc w:val="center"/>
         </w:trPr>
         <w:tc>
           <w:tcPr>
-            <w:tcW w:w="2560" w:type="dxa"/>
+            <w:tcW w:w="0" w:type="auto"/>
             <w:vAlign w:val="center"/>
             <w:hideMark/>
           </w:tcPr>
@@ -244,7 +242,7 @@
         </w:tc>
         <w:tc>
           <w:tcPr>
-            <w:tcW w:w="2040" w:type="dxa"/>
+            <w:tcW w:w="0" w:type="auto"/>
             <w:vAlign w:val="center"/>
             <w:hideMark/>
           </w:tcPr>
@@ -270,7 +268,7 @@
         </w:tc>
         <w:tc>
           <w:tcPr>
-            <w:tcW w:w="2400" w:type="dxa"/>
+            <w:tcW w:w="0" w:type="auto"/>
             <w:vAlign w:val="center"/>
             <w:hideMark/>
           </w:tcPr>
@@ -296,7 +294,7 @@
         </w:tc>
         <w:tc>
           <w:tcPr>
-            <w:tcW w:w="2200" w:type="dxa"/>
+            <w:tcW w:w="0" w:type="auto"/>
             <w:vAlign w:val="center"/>
             <w:hideMark/>
           </w:tcPr>
@@ -324,11 +322,10 @@
       <w:tr>
         <w:trPr>
           <w:tblCellSpacing w:w="15" w:type="dxa"/>
-          <w:jc w:val="center"/>
         </w:trPr>
         <w:tc>
           <w:tcPr>
-            <w:tcW w:w="2560" w:type="dxa"/>
+            <w:tcW w:w="0" w:type="auto"/>
             <w:vAlign w:val="center"/>
             <w:hideMark/>
           </w:tcPr>
@@ -338,11 +335,15 @@
               <w:jc w:val="center"/>
               <w:rPr>
                 <w:rFonts w:ascii="Times New Roman" w:hAnsi="Times New Roman" w:cs="Times New Roman"/>
+                <w:b/>
+                <w:bCs/>
               </w:rPr>
             </w:pPr>
             <w:r>
               <w:rPr>
                 <w:rFonts w:ascii="Times New Roman" w:hAnsi="Times New Roman" w:cs="Times New Roman"/>
+                <w:b/>
+                <w:bCs/>
               </w:rPr>
               <w:t>GPT-2 (FP32)</w:t>
             </w:r>
@@ -350,7 +351,7 @@
         </w:tc>
         <w:tc>
           <w:tcPr>
-            <w:tcW w:w="2040" w:type="dxa"/>
+            <w:tcW w:w="0" w:type="auto"/>
             <w:vAlign w:val="center"/>
             <w:hideMark/>
           </w:tcPr>
@@ -360,31 +361,23 @@
               <w:jc w:val="center"/>
               <w:rPr>
                 <w:rFonts w:ascii="Times New Roman" w:hAnsi="Times New Roman" w:cs="Times New Roman"/>
+                <w:b/>
+                <w:bCs/>
               </w:rPr>
             </w:pPr>
             <w:r>
               <w:rPr>
                 <w:rFonts w:ascii="Times New Roman" w:hAnsi="Times New Roman" w:cs="Times New Roman"/>
-              </w:rPr>
-              <w:t>124</w:t>
-            </w:r>
-            <w:r>
-              <w:rPr>
-                <w:rFonts w:ascii="Times New Roman" w:hAnsi="Times New Roman" w:cs="Times New Roman"/>
-              </w:rPr>
-              <w:t xml:space="preserve"> m</w:t>
-            </w:r>
-            <w:r>
-              <w:rPr>
-                <w:rFonts w:ascii="Times New Roman" w:hAnsi="Times New Roman" w:cs="Times New Roman"/>
-              </w:rPr>
-              <w:t>illion</w:t>
+                <w:b/>
+                <w:bCs/>
+              </w:rPr>
+              <w:t>124 million</w:t>
             </w:r>
           </w:p>
         </w:tc>
         <w:tc>
           <w:tcPr>
-            <w:tcW w:w="2400" w:type="dxa"/>
+            <w:tcW w:w="0" w:type="auto"/>
             <w:vAlign w:val="center"/>
             <w:hideMark/>
           </w:tcPr>
@@ -394,31 +387,23 @@
               <w:jc w:val="center"/>
               <w:rPr>
                 <w:rFonts w:ascii="Times New Roman" w:hAnsi="Times New Roman" w:cs="Times New Roman"/>
+                <w:b/>
+                <w:bCs/>
               </w:rPr>
             </w:pPr>
             <w:r>
               <w:rPr>
                 <w:rFonts w:ascii="Times New Roman" w:hAnsi="Times New Roman" w:cs="Times New Roman"/>
-              </w:rPr>
-              <w:t xml:space="preserve">248 </w:t>
-            </w:r>
-            <w:r>
-              <w:rPr>
-                <w:rFonts w:ascii="Times New Roman" w:hAnsi="Times New Roman" w:cs="Times New Roman"/>
-              </w:rPr>
-              <w:t>m</w:t>
-            </w:r>
-            <w:r>
-              <w:rPr>
-                <w:rFonts w:ascii="Times New Roman" w:hAnsi="Times New Roman" w:cs="Times New Roman"/>
-              </w:rPr>
-              <w:t>illion</w:t>
+                <w:b/>
+                <w:bCs/>
+              </w:rPr>
+              <w:t>~248 million</w:t>
             </w:r>
           </w:p>
         </w:tc>
         <w:tc>
           <w:tcPr>
-            <w:tcW w:w="2200" w:type="dxa"/>
+            <w:tcW w:w="0" w:type="auto"/>
             <w:vAlign w:val="center"/>
             <w:hideMark/>
           </w:tcPr>
@@ -428,13 +413,17 @@
               <w:jc w:val="center"/>
               <w:rPr>
                 <w:rFonts w:ascii="Times New Roman" w:hAnsi="Times New Roman" w:cs="Times New Roman"/>
+                <w:b/>
+                <w:bCs/>
               </w:rPr>
             </w:pPr>
             <w:r>
               <w:rPr>
                 <w:rFonts w:ascii="Times New Roman" w:hAnsi="Times New Roman" w:cs="Times New Roman"/>
-              </w:rPr>
-              <w:t>12.4 GFLOPs</w:t>
+                <w:b/>
+                <w:bCs/>
+              </w:rPr>
+              <w:t>~12.4 GFLOPs</w:t>
             </w:r>
           </w:p>
         </w:tc>
@@ -442,11 +431,10 @@
       <w:tr>
         <w:trPr>
           <w:tblCellSpacing w:w="15" w:type="dxa"/>
-          <w:jc w:val="center"/>
         </w:trPr>
         <w:tc>
           <w:tcPr>
-            <w:tcW w:w="2560" w:type="dxa"/>
+            <w:tcW w:w="0" w:type="auto"/>
             <w:vAlign w:val="center"/>
             <w:hideMark/>
           </w:tcPr>
@@ -456,25 +444,23 @@
               <w:jc w:val="center"/>
               <w:rPr>
                 <w:rFonts w:ascii="Times New Roman" w:hAnsi="Times New Roman" w:cs="Times New Roman"/>
+                <w:b/>
+                <w:bCs/>
               </w:rPr>
             </w:pPr>
             <w:r>
               <w:rPr>
                 <w:rFonts w:ascii="Times New Roman" w:hAnsi="Times New Roman" w:cs="Times New Roman"/>
-              </w:rPr>
-              <w:t>Q</w:t>
-            </w:r>
-            <w:r>
-              <w:rPr>
-                <w:rFonts w:ascii="Times New Roman" w:hAnsi="Times New Roman" w:cs="Times New Roman"/>
-              </w:rPr>
-              <w:t>uantized GPT-2 (INT8)</w:t>
+                <w:b/>
+                <w:bCs/>
+              </w:rPr>
+              <w:t>GPT-2 (FP16)</w:t>
             </w:r>
           </w:p>
         </w:tc>
         <w:tc>
           <w:tcPr>
-            <w:tcW w:w="2040" w:type="dxa"/>
+            <w:tcW w:w="0" w:type="auto"/>
             <w:vAlign w:val="center"/>
             <w:hideMark/>
           </w:tcPr>
@@ -484,31 +470,23 @@
               <w:jc w:val="center"/>
               <w:rPr>
                 <w:rFonts w:ascii="Times New Roman" w:hAnsi="Times New Roman" w:cs="Times New Roman"/>
+                <w:b/>
+                <w:bCs/>
               </w:rPr>
             </w:pPr>
             <w:r>
               <w:rPr>
                 <w:rFonts w:ascii="Times New Roman" w:hAnsi="Times New Roman" w:cs="Times New Roman"/>
-              </w:rPr>
-              <w:t>124</w:t>
-            </w:r>
-            <w:r>
-              <w:rPr>
-                <w:rFonts w:ascii="Times New Roman" w:hAnsi="Times New Roman" w:cs="Times New Roman"/>
-              </w:rPr>
-              <w:t xml:space="preserve"> m</w:t>
-            </w:r>
-            <w:r>
-              <w:rPr>
-                <w:rFonts w:ascii="Times New Roman" w:hAnsi="Times New Roman" w:cs="Times New Roman"/>
-              </w:rPr>
-              <w:t>illion</w:t>
+                <w:b/>
+                <w:bCs/>
+              </w:rPr>
+              <w:t>124 million</w:t>
             </w:r>
           </w:p>
         </w:tc>
         <w:tc>
           <w:tcPr>
-            <w:tcW w:w="2400" w:type="dxa"/>
+            <w:tcW w:w="0" w:type="auto"/>
             <w:vAlign w:val="center"/>
             <w:hideMark/>
           </w:tcPr>
@@ -518,19 +496,23 @@
               <w:jc w:val="center"/>
               <w:rPr>
                 <w:rFonts w:ascii="Times New Roman" w:hAnsi="Times New Roman" w:cs="Times New Roman"/>
+                <w:b/>
+                <w:bCs/>
               </w:rPr>
             </w:pPr>
             <w:r>
               <w:rPr>
                 <w:rFonts w:ascii="Times New Roman" w:hAnsi="Times New Roman" w:cs="Times New Roman"/>
-              </w:rPr>
-              <w:t>~124 million (effective)</w:t>
+                <w:b/>
+                <w:bCs/>
+              </w:rPr>
+              <w:t>~248 million</w:t>
             </w:r>
           </w:p>
         </w:tc>
         <w:tc>
           <w:tcPr>
-            <w:tcW w:w="2200" w:type="dxa"/>
+            <w:tcW w:w="0" w:type="auto"/>
             <w:vAlign w:val="center"/>
             <w:hideMark/>
           </w:tcPr>
@@ -540,13 +522,364 @@
               <w:jc w:val="center"/>
               <w:rPr>
                 <w:rFonts w:ascii="Times New Roman" w:hAnsi="Times New Roman" w:cs="Times New Roman"/>
+                <w:b/>
+                <w:bCs/>
               </w:rPr>
             </w:pPr>
             <w:r>
               <w:rPr>
                 <w:rFonts w:ascii="Times New Roman" w:hAnsi="Times New Roman" w:cs="Times New Roman"/>
+                <w:b/>
+                <w:bCs/>
+              </w:rPr>
+              <w:t>~12.4 GFLOPs</w:t>
+            </w:r>
+          </w:p>
+        </w:tc>
+      </w:tr>
+      <w:tr>
+        <w:trPr>
+          <w:tblCellSpacing w:w="15" w:type="dxa"/>
+        </w:trPr>
+        <w:tc>
+          <w:tcPr>
+            <w:tcW w:w="0" w:type="auto"/>
+            <w:vAlign w:val="center"/>
+            <w:hideMark/>
+          </w:tcPr>
+          <w:p>
+            <w:pPr>
+              <w:spacing w:line="276" w:lineRule="auto"/>
+              <w:jc w:val="center"/>
+              <w:rPr>
+                <w:rFonts w:ascii="Times New Roman" w:hAnsi="Times New Roman" w:cs="Times New Roman"/>
+                <w:b/>
+                <w:bCs/>
+              </w:rPr>
+            </w:pPr>
+            <w:r>
+              <w:rPr>
+                <w:rFonts w:ascii="Times New Roman" w:hAnsi="Times New Roman" w:cs="Times New Roman"/>
+                <w:b/>
+                <w:bCs/>
+              </w:rPr>
+              <w:t>Dynamic INT8</w:t>
+            </w:r>
+          </w:p>
+        </w:tc>
+        <w:tc>
+          <w:tcPr>
+            <w:tcW w:w="0" w:type="auto"/>
+            <w:vAlign w:val="center"/>
+            <w:hideMark/>
+          </w:tcPr>
+          <w:p>
+            <w:pPr>
+              <w:spacing w:line="276" w:lineRule="auto"/>
+              <w:jc w:val="center"/>
+              <w:rPr>
+                <w:rFonts w:ascii="Times New Roman" w:hAnsi="Times New Roman" w:cs="Times New Roman"/>
+                <w:b/>
+                <w:bCs/>
+              </w:rPr>
+            </w:pPr>
+            <w:r>
+              <w:rPr>
+                <w:rFonts w:ascii="Times New Roman" w:hAnsi="Times New Roman" w:cs="Times New Roman"/>
+                <w:b/>
+                <w:bCs/>
+              </w:rPr>
+              <w:t>124 million</w:t>
+            </w:r>
+          </w:p>
+        </w:tc>
+        <w:tc>
+          <w:tcPr>
+            <w:tcW w:w="0" w:type="auto"/>
+            <w:vAlign w:val="center"/>
+            <w:hideMark/>
+          </w:tcPr>
+          <w:p>
+            <w:pPr>
+              <w:spacing w:line="276" w:lineRule="auto"/>
+              <w:jc w:val="center"/>
+              <w:rPr>
+                <w:rFonts w:ascii="Times New Roman" w:hAnsi="Times New Roman" w:cs="Times New Roman"/>
+                <w:b/>
+                <w:bCs/>
+              </w:rPr>
+            </w:pPr>
+            <w:r>
+              <w:rPr>
+                <w:rFonts w:ascii="Times New Roman" w:hAnsi="Times New Roman" w:cs="Times New Roman"/>
+                <w:b/>
+                <w:bCs/>
+              </w:rPr>
+              <w:t>~124 million (effective)</w:t>
+            </w:r>
+          </w:p>
+        </w:tc>
+        <w:tc>
+          <w:tcPr>
+            <w:tcW w:w="0" w:type="auto"/>
+            <w:vAlign w:val="center"/>
+            <w:hideMark/>
+          </w:tcPr>
+          <w:p>
+            <w:pPr>
+              <w:spacing w:line="276" w:lineRule="auto"/>
+              <w:jc w:val="center"/>
+              <w:rPr>
+                <w:rFonts w:ascii="Times New Roman" w:hAnsi="Times New Roman" w:cs="Times New Roman"/>
+                <w:b/>
+                <w:bCs/>
+              </w:rPr>
+            </w:pPr>
+            <w:r>
+              <w:rPr>
+                <w:rFonts w:ascii="Times New Roman" w:hAnsi="Times New Roman" w:cs="Times New Roman"/>
+                <w:b/>
+                <w:bCs/>
               </w:rPr>
               <w:t>~6.2 GFLOPs</w:t>
+            </w:r>
+          </w:p>
+        </w:tc>
+      </w:tr>
+      <w:tr>
+        <w:trPr>
+          <w:tblCellSpacing w:w="15" w:type="dxa"/>
+        </w:trPr>
+        <w:tc>
+          <w:tcPr>
+            <w:tcW w:w="0" w:type="auto"/>
+            <w:vAlign w:val="center"/>
+            <w:hideMark/>
+          </w:tcPr>
+          <w:p>
+            <w:pPr>
+              <w:spacing w:line="276" w:lineRule="auto"/>
+              <w:jc w:val="center"/>
+              <w:rPr>
+                <w:rFonts w:ascii="Times New Roman" w:hAnsi="Times New Roman" w:cs="Times New Roman"/>
+                <w:b/>
+                <w:bCs/>
+              </w:rPr>
+            </w:pPr>
+            <w:proofErr w:type="spellStart"/>
+            <w:r>
+              <w:rPr>
+                <w:rFonts w:ascii="Times New Roman" w:hAnsi="Times New Roman" w:cs="Times New Roman"/>
+                <w:b/>
+                <w:bCs/>
+              </w:rPr>
+              <w:t>BitsAndBytes</w:t>
+            </w:r>
+            <w:proofErr w:type="spellEnd"/>
+            <w:r>
+              <w:rPr>
+                <w:rFonts w:ascii="Times New Roman" w:hAnsi="Times New Roman" w:cs="Times New Roman"/>
+                <w:b/>
+                <w:bCs/>
+              </w:rPr>
+              <w:t xml:space="preserve"> INT8</w:t>
+            </w:r>
+          </w:p>
+        </w:tc>
+        <w:tc>
+          <w:tcPr>
+            <w:tcW w:w="0" w:type="auto"/>
+            <w:vAlign w:val="center"/>
+            <w:hideMark/>
+          </w:tcPr>
+          <w:p>
+            <w:pPr>
+              <w:spacing w:line="276" w:lineRule="auto"/>
+              <w:jc w:val="center"/>
+              <w:rPr>
+                <w:rFonts w:ascii="Times New Roman" w:hAnsi="Times New Roman" w:cs="Times New Roman"/>
+                <w:b/>
+                <w:bCs/>
+              </w:rPr>
+            </w:pPr>
+            <w:r>
+              <w:rPr>
+                <w:rFonts w:ascii="Times New Roman" w:hAnsi="Times New Roman" w:cs="Times New Roman"/>
+                <w:b/>
+                <w:bCs/>
+              </w:rPr>
+              <w:t>124 million</w:t>
+            </w:r>
+          </w:p>
+        </w:tc>
+        <w:tc>
+          <w:tcPr>
+            <w:tcW w:w="0" w:type="auto"/>
+            <w:vAlign w:val="center"/>
+            <w:hideMark/>
+          </w:tcPr>
+          <w:p>
+            <w:pPr>
+              <w:spacing w:line="276" w:lineRule="auto"/>
+              <w:jc w:val="center"/>
+              <w:rPr>
+                <w:rFonts w:ascii="Times New Roman" w:hAnsi="Times New Roman" w:cs="Times New Roman"/>
+                <w:b/>
+                <w:bCs/>
+              </w:rPr>
+            </w:pPr>
+            <w:r>
+              <w:rPr>
+                <w:rFonts w:ascii="Times New Roman" w:hAnsi="Times New Roman" w:cs="Times New Roman"/>
+                <w:b/>
+                <w:bCs/>
+              </w:rPr>
+              <w:t>~124 million (effective)</w:t>
+            </w:r>
+          </w:p>
+        </w:tc>
+        <w:tc>
+          <w:tcPr>
+            <w:tcW w:w="0" w:type="auto"/>
+            <w:vAlign w:val="center"/>
+            <w:hideMark/>
+          </w:tcPr>
+          <w:p>
+            <w:pPr>
+              <w:spacing w:line="276" w:lineRule="auto"/>
+              <w:jc w:val="center"/>
+              <w:rPr>
+                <w:rFonts w:ascii="Times New Roman" w:hAnsi="Times New Roman" w:cs="Times New Roman"/>
+                <w:b/>
+                <w:bCs/>
+              </w:rPr>
+            </w:pPr>
+            <w:r>
+              <w:rPr>
+                <w:rFonts w:ascii="Times New Roman" w:hAnsi="Times New Roman" w:cs="Times New Roman"/>
+                <w:b/>
+                <w:bCs/>
+              </w:rPr>
+              <w:t>~6.2 GFLOPs</w:t>
+            </w:r>
+          </w:p>
+        </w:tc>
+      </w:tr>
+      <w:tr>
+        <w:trPr>
+          <w:tblCellSpacing w:w="15" w:type="dxa"/>
+        </w:trPr>
+        <w:tc>
+          <w:tcPr>
+            <w:tcW w:w="0" w:type="auto"/>
+            <w:vAlign w:val="center"/>
+            <w:hideMark/>
+          </w:tcPr>
+          <w:p>
+            <w:pPr>
+              <w:spacing w:line="276" w:lineRule="auto"/>
+              <w:jc w:val="center"/>
+              <w:rPr>
+                <w:rFonts w:ascii="Times New Roman" w:hAnsi="Times New Roman" w:cs="Times New Roman"/>
+                <w:b/>
+                <w:bCs/>
+              </w:rPr>
+            </w:pPr>
+            <w:proofErr w:type="spellStart"/>
+            <w:r>
+              <w:rPr>
+                <w:rFonts w:ascii="Times New Roman" w:hAnsi="Times New Roman" w:cs="Times New Roman"/>
+                <w:b/>
+                <w:bCs/>
+              </w:rPr>
+              <w:t>BitsAndBytes</w:t>
+            </w:r>
+            <w:proofErr w:type="spellEnd"/>
+            <w:r>
+              <w:rPr>
+                <w:rFonts w:ascii="Times New Roman" w:hAnsi="Times New Roman" w:cs="Times New Roman"/>
+                <w:b/>
+                <w:bCs/>
+              </w:rPr>
+              <w:t xml:space="preserve"> 4-bit (NF4)</w:t>
+            </w:r>
+          </w:p>
+        </w:tc>
+        <w:tc>
+          <w:tcPr>
+            <w:tcW w:w="0" w:type="auto"/>
+            <w:vAlign w:val="center"/>
+            <w:hideMark/>
+          </w:tcPr>
+          <w:p>
+            <w:pPr>
+              <w:spacing w:line="276" w:lineRule="auto"/>
+              <w:jc w:val="center"/>
+              <w:rPr>
+                <w:rFonts w:ascii="Times New Roman" w:hAnsi="Times New Roman" w:cs="Times New Roman"/>
+                <w:b/>
+                <w:bCs/>
+              </w:rPr>
+            </w:pPr>
+            <w:r>
+              <w:rPr>
+                <w:rFonts w:ascii="Times New Roman" w:hAnsi="Times New Roman" w:cs="Times New Roman"/>
+                <w:b/>
+                <w:bCs/>
+              </w:rPr>
+              <w:t>124 million</w:t>
+            </w:r>
+          </w:p>
+        </w:tc>
+        <w:tc>
+          <w:tcPr>
+            <w:tcW w:w="0" w:type="auto"/>
+            <w:vAlign w:val="center"/>
+            <w:hideMark/>
+          </w:tcPr>
+          <w:p>
+            <w:pPr>
+              <w:spacing w:line="276" w:lineRule="auto"/>
+              <w:jc w:val="center"/>
+              <w:rPr>
+                <w:rFonts w:ascii="Times New Roman" w:hAnsi="Times New Roman" w:cs="Times New Roman"/>
+                <w:b/>
+                <w:bCs/>
+              </w:rPr>
+            </w:pPr>
+            <w:r>
+              <w:rPr>
+                <w:rFonts w:ascii="Times New Roman" w:hAnsi="Times New Roman" w:cs="Times New Roman"/>
+                <w:b/>
+                <w:bCs/>
+              </w:rPr>
+              <w:t>~62 million (effective)</w:t>
+            </w:r>
+          </w:p>
+        </w:tc>
+        <w:tc>
+          <w:tcPr>
+            <w:tcW w:w="0" w:type="auto"/>
+            <w:vAlign w:val="center"/>
+            <w:hideMark/>
+          </w:tcPr>
+          <w:p>
+            <w:pPr>
+              <w:spacing w:line="276" w:lineRule="auto"/>
+              <w:jc w:val="center"/>
+              <w:rPr>
+                <w:rFonts w:ascii="Times New Roman" w:hAnsi="Times New Roman" w:cs="Times New Roman"/>
+                <w:b/>
+                <w:bCs/>
+              </w:rPr>
+            </w:pPr>
+            <w:r>
+              <w:rPr>
+                <w:rFonts w:ascii="Times New Roman" w:hAnsi="Times New Roman" w:cs="Times New Roman"/>
+                <w:b/>
+                <w:bCs/>
+              </w:rPr>
+              <w:t>~3.1 GFLOPs</w:t>
             </w:r>
           </w:p>
         </w:tc>
@@ -555,6 +888,7 @@
     <w:p>
       <w:pPr>
         <w:spacing w:line="276" w:lineRule="auto"/>
+        <w:jc w:val="center"/>
         <w:rPr>
           <w:rFonts w:ascii="Times New Roman" w:hAnsi="Times New Roman" w:cs="Times New Roman"/>
           <w:b/>
@@ -597,7 +931,7 @@
         <w:rPr>
           <w:rFonts w:ascii="Times New Roman" w:hAnsi="Times New Roman" w:cs="Times New Roman"/>
         </w:rPr>
-        <w:t xml:space="preserve">Dynamic INT8 quantization reduced the effective computational workload during inference by replacing floating-point operations with integer operations in supported linear layers. </w:t>
+        <w:t xml:space="preserve">FP32 and FP16 maintain the same theoretical computational complexity because both preserve the original model architecture and parameter count. </w:t>
       </w:r>
     </w:p>
     <w:p>
@@ -615,7 +949,21 @@
         <w:rPr>
           <w:rFonts w:ascii="Times New Roman" w:hAnsi="Times New Roman" w:cs="Times New Roman"/>
         </w:rPr>
-        <w:t xml:space="preserve">The number of model parameters remained unchanged, but the computational cost per operation decreased substantially. </w:t>
+        <w:t xml:space="preserve">Dynamic INT8 and </w:t>
+      </w:r>
+      <w:proofErr w:type="spellStart"/>
+      <w:r>
+        <w:rPr>
+          <w:rFonts w:ascii="Times New Roman" w:hAnsi="Times New Roman" w:cs="Times New Roman"/>
+        </w:rPr>
+        <w:t>BitsAndBytes</w:t>
+      </w:r>
+      <w:proofErr w:type="spellEnd"/>
+      <w:r>
+        <w:rPr>
+          <w:rFonts w:ascii="Times New Roman" w:hAnsi="Times New Roman" w:cs="Times New Roman"/>
+        </w:rPr>
+        <w:t xml:space="preserve"> INT8 reduce the effective computational workload by replacing floating-point arithmetic with lower-precision integer operations where supported. </w:t>
       </w:r>
     </w:p>
     <w:p>
@@ -629,11 +977,19 @@
           <w:rFonts w:ascii="Times New Roman" w:hAnsi="Times New Roman" w:cs="Times New Roman"/>
         </w:rPr>
       </w:pPr>
-      <w:r>
-        <w:rPr>
-          <w:rFonts w:ascii="Times New Roman" w:hAnsi="Times New Roman" w:cs="Times New Roman"/>
-        </w:rPr>
-        <w:t xml:space="preserve">The quantized model achieved faster inference while producing outputs comparable to the original GPT-2 model. </w:t>
+      <w:proofErr w:type="spellStart"/>
+      <w:r>
+        <w:rPr>
+          <w:rFonts w:ascii="Times New Roman" w:hAnsi="Times New Roman" w:cs="Times New Roman"/>
+        </w:rPr>
+        <w:t>BitsAndBytes</w:t>
+      </w:r>
+      <w:proofErr w:type="spellEnd"/>
+      <w:r>
+        <w:rPr>
+          <w:rFonts w:ascii="Times New Roman" w:hAnsi="Times New Roman" w:cs="Times New Roman"/>
+        </w:rPr>
+        <w:t xml:space="preserve"> 4-bit (NF4) provides the greatest reduction in effective computational complexity by storing model weights using four-bit precision. </w:t>
       </w:r>
     </w:p>
     <w:p>
@@ -651,7 +1007,8 @@
         <w:rPr>
           <w:rFonts w:ascii="Times New Roman" w:hAnsi="Times New Roman" w:cs="Times New Roman"/>
         </w:rPr>
-        <w:t xml:space="preserve">Reduced computational complexity resulted in lower estimated energy consumption and carbon emissions measured using CodeCarbon. </w:t>
+        <w:lastRenderedPageBreak/>
+        <w:t xml:space="preserve">Although lower-precision methods reduce theoretical FLOPs, the measured inference runtime depends heavily on hardware support and software implementation. </w:t>
       </w:r>
     </w:p>
     <w:p>
@@ -669,7 +1026,67 @@
         <w:rPr>
           <w:rFonts w:ascii="Times New Roman" w:hAnsi="Times New Roman" w:cs="Times New Roman"/>
         </w:rPr>
-        <w:t>Quantization improved inference efficiency without requiring changes to the model architecture or inference pipeline.</w:t>
+        <w:t xml:space="preserve">Experimental results showed that FP32 and FP16 achieved the fastest inference on the NVIDIA Tesla T4 GPU, while </w:t>
+      </w:r>
+      <w:proofErr w:type="spellStart"/>
+      <w:r>
+        <w:rPr>
+          <w:rFonts w:ascii="Times New Roman" w:hAnsi="Times New Roman" w:cs="Times New Roman"/>
+        </w:rPr>
+        <w:t>BitsAndBytes</w:t>
+      </w:r>
+      <w:proofErr w:type="spellEnd"/>
+      <w:r>
+        <w:rPr>
+          <w:rFonts w:ascii="Times New Roman" w:hAnsi="Times New Roman" w:cs="Times New Roman"/>
+        </w:rPr>
+        <w:t xml:space="preserve"> 4-bit (NF4) was the most efficient </w:t>
+      </w:r>
+      <w:proofErr w:type="gramStart"/>
+      <w:r>
+        <w:rPr>
+          <w:rFonts w:ascii="Times New Roman" w:hAnsi="Times New Roman" w:cs="Times New Roman"/>
+        </w:rPr>
+        <w:t>quantized</w:t>
+      </w:r>
+      <w:proofErr w:type="gramEnd"/>
+      <w:r>
+        <w:rPr>
+          <w:rFonts w:ascii="Times New Roman" w:hAnsi="Times New Roman" w:cs="Times New Roman"/>
+        </w:rPr>
+        <w:t xml:space="preserve"> implementation. </w:t>
+      </w:r>
+    </w:p>
+    <w:p>
+      <w:pPr>
+        <w:numPr>
+          <w:ilvl w:val="0"/>
+          <w:numId w:val="1"/>
+        </w:numPr>
+        <w:spacing w:line="276" w:lineRule="auto"/>
+        <w:rPr>
+          <w:rFonts w:ascii="Times New Roman" w:hAnsi="Times New Roman" w:cs="Times New Roman"/>
+        </w:rPr>
+      </w:pPr>
+      <w:r>
+        <w:rPr>
+          <w:rFonts w:ascii="Times New Roman" w:hAnsi="Times New Roman" w:cs="Times New Roman"/>
+        </w:rPr>
+        <w:t xml:space="preserve">Dynamic INT8 and </w:t>
+      </w:r>
+      <w:proofErr w:type="spellStart"/>
+      <w:r>
+        <w:rPr>
+          <w:rFonts w:ascii="Times New Roman" w:hAnsi="Times New Roman" w:cs="Times New Roman"/>
+        </w:rPr>
+        <w:t>BitsAndBytes</w:t>
+      </w:r>
+      <w:proofErr w:type="spellEnd"/>
+      <w:r>
+        <w:rPr>
+          <w:rFonts w:ascii="Times New Roman" w:hAnsi="Times New Roman" w:cs="Times New Roman"/>
+        </w:rPr>
+        <w:t xml:space="preserve"> INT8 introduced additional execution overhead despite their lower theoretical computational complexity.</w:t>
       </w:r>
     </w:p>
     <w:p>
@@ -705,8 +1122,63 @@
         <w:rPr>
           <w:rFonts w:ascii="Times New Roman" w:hAnsi="Times New Roman" w:cs="Times New Roman"/>
         </w:rPr>
-        <w:lastRenderedPageBreak/>
-        <w:t>The quantized GPT-2 inference experiments demonstrate that dynamic INT8 quantization is an effective optimization technique for reducing computational complexity and environmental impact. Although the model retains the same number of parameters, lower-precision arithmetic significantly reduces the effective computational workload, leading to shorter execution times, lower energy consumption, and reduced carbon emissions while maintaining similar inference quality. These results highlight quantization as a practical approach for deploying more energy-efficient and environmentally sustainable Large Language Models.</w:t>
+        <w:t>The quantization experiments demonstrate that reducing numerical precision decreases the theoretical computational workload of GPT-2 inference. However, practical inference performance depends not only on FLOPs but also on hardware architecture, memory access patterns, and software implementation.</w:t>
+      </w:r>
+    </w:p>
+    <w:p>
+      <w:pPr>
+        <w:spacing w:line="276" w:lineRule="auto"/>
+        <w:rPr>
+          <w:rFonts w:ascii="Times New Roman" w:hAnsi="Times New Roman" w:cs="Times New Roman"/>
+        </w:rPr>
+      </w:pPr>
+      <w:r>
+        <w:rPr>
+          <w:rFonts w:ascii="Times New Roman" w:hAnsi="Times New Roman" w:cs="Times New Roman"/>
+        </w:rPr>
+        <w:t xml:space="preserve">Among the evaluated quantization methods, </w:t>
+      </w:r>
+      <w:proofErr w:type="spellStart"/>
+      <w:r>
+        <w:rPr>
+          <w:rFonts w:ascii="Times New Roman" w:hAnsi="Times New Roman" w:cs="Times New Roman"/>
+        </w:rPr>
+        <w:t>BitsAndBytes</w:t>
+      </w:r>
+      <w:proofErr w:type="spellEnd"/>
+      <w:r>
+        <w:rPr>
+          <w:rFonts w:ascii="Times New Roman" w:hAnsi="Times New Roman" w:cs="Times New Roman"/>
+        </w:rPr>
+        <w:t xml:space="preserve"> 4-bit (NF4) provided the most effective balance between computational efficiency and environmental impact. FP32 and FP16 achieved the fastest inference performance on the NVIDIA Tesla T4 GPU, while Dynamic INT8 and </w:t>
+      </w:r>
+      <w:proofErr w:type="spellStart"/>
+      <w:r>
+        <w:rPr>
+          <w:rFonts w:ascii="Times New Roman" w:hAnsi="Times New Roman" w:cs="Times New Roman"/>
+        </w:rPr>
+        <w:t>BitsAndBytes</w:t>
+      </w:r>
+      <w:proofErr w:type="spellEnd"/>
+      <w:r>
+        <w:rPr>
+          <w:rFonts w:ascii="Times New Roman" w:hAnsi="Times New Roman" w:cs="Times New Roman"/>
+        </w:rPr>
+        <w:t xml:space="preserve"> INT8 incurred additional execution overhead despite their lower theoretical FLOPs.</w:t>
+      </w:r>
+    </w:p>
+    <w:p>
+      <w:pPr>
+        <w:spacing w:line="276" w:lineRule="auto"/>
+        <w:rPr>
+          <w:rFonts w:ascii="Times New Roman" w:hAnsi="Times New Roman" w:cs="Times New Roman"/>
+        </w:rPr>
+      </w:pPr>
+      <w:r>
+        <w:rPr>
+          <w:rFonts w:ascii="Times New Roman" w:hAnsi="Times New Roman" w:cs="Times New Roman"/>
+        </w:rPr>
+        <w:t>These findings highlight that theoretical reductions in computational complexity do not always translate directly into lower runtime or energy consumption, emphasizing the importance of empirical evaluation when selecting quantization strategies for energy-efficient deployment of large language models.</w:t>
       </w:r>
     </w:p>
     <w:sectPr>

</xml_diff>